<commit_message>
Updated Readme and Project Files
</commit_message>
<xml_diff>
--- a/ProjectFiles/Project report structure draft.docx
+++ b/ProjectFiles/Project report structure draft.docx
@@ -8,341 +8,371 @@
         <w:ind w:left="360"/>
         <w:rPr>
           <w:rFonts w:ascii="Times New Roman" w:eastAsia="Times New Roman" w:hAnsi="Times New Roman" w:cs="Times New Roman"/>
-          <w:sz w:val="24"/>
-          <w:szCs w:val="24"/>
-        </w:rPr>
-      </w:pPr>
-      <w:r>
-        <w:rPr>
-          <w:rFonts w:ascii="Times New Roman" w:eastAsia="Times New Roman" w:hAnsi="Times New Roman" w:cs="Times New Roman"/>
-          <w:b/>
-          <w:bCs/>
-          <w:sz w:val="24"/>
-          <w:szCs w:val="24"/>
-        </w:rPr>
-        <w:t>Chapter 1: Introduction</w:t>
-      </w:r>
-    </w:p>
-    <w:p>
-      <w:pPr>
-        <w:spacing w:before="100" w:beforeAutospacing="1" w:after="100" w:afterAutospacing="1" w:line="240" w:lineRule="auto"/>
-        <w:ind w:left="1080"/>
-        <w:rPr>
-          <w:rFonts w:ascii="Times New Roman" w:eastAsia="Times New Roman" w:hAnsi="Times New Roman" w:cs="Times New Roman"/>
-          <w:sz w:val="24"/>
-          <w:szCs w:val="24"/>
-        </w:rPr>
-      </w:pPr>
-      <w:r>
-        <w:rPr>
-          <w:rFonts w:ascii="Times New Roman" w:eastAsia="Times New Roman" w:hAnsi="Times New Roman" w:cs="Times New Roman"/>
-          <w:sz w:val="24"/>
-          <w:szCs w:val="24"/>
-        </w:rPr>
-        <w:t>1</w:t>
-      </w:r>
-      <w:r>
-        <w:rPr>
-          <w:rFonts w:ascii="Times New Roman" w:eastAsia="Times New Roman" w:hAnsi="Times New Roman" w:cs="Times New Roman"/>
-          <w:sz w:val="24"/>
-          <w:szCs w:val="24"/>
-        </w:rPr>
-        <w:t xml:space="preserve">.1 Background and </w:t>
-      </w:r>
-      <w:r>
-        <w:rPr>
-          <w:rFonts w:ascii="Times New Roman" w:eastAsia="Times New Roman" w:hAnsi="Times New Roman" w:cs="Times New Roman"/>
-          <w:sz w:val="24"/>
-          <w:szCs w:val="24"/>
-        </w:rPr>
-        <w:t>Motivation</w:t>
-      </w:r>
-    </w:p>
-    <w:p>
-      <w:pPr>
-        <w:spacing w:before="100" w:beforeAutospacing="1" w:after="100" w:afterAutospacing="1" w:line="240" w:lineRule="auto"/>
-        <w:ind w:left="1080"/>
-        <w:rPr>
-          <w:rFonts w:ascii="Times New Roman" w:eastAsia="Times New Roman" w:hAnsi="Times New Roman" w:cs="Times New Roman"/>
-          <w:sz w:val="24"/>
-          <w:szCs w:val="24"/>
-        </w:rPr>
-      </w:pPr>
-      <w:r>
-        <w:rPr>
-          <w:rFonts w:ascii="Times New Roman" w:eastAsia="Times New Roman" w:hAnsi="Times New Roman" w:cs="Times New Roman"/>
-          <w:sz w:val="24"/>
-          <w:szCs w:val="24"/>
-        </w:rPr>
-        <w:t>1.2 Research Problem Statement</w:t>
-      </w:r>
-    </w:p>
-    <w:p>
-      <w:pPr>
-        <w:spacing w:before="100" w:beforeAutospacing="1" w:after="100" w:afterAutospacing="1" w:line="240" w:lineRule="auto"/>
-        <w:ind w:left="1080"/>
-        <w:rPr>
-          <w:rFonts w:ascii="Times New Roman" w:eastAsia="Times New Roman" w:hAnsi="Times New Roman" w:cs="Times New Roman"/>
-          <w:sz w:val="24"/>
-          <w:szCs w:val="24"/>
-        </w:rPr>
-      </w:pPr>
-      <w:r>
-        <w:rPr>
-          <w:rFonts w:ascii="Times New Roman" w:eastAsia="Times New Roman" w:hAnsi="Times New Roman" w:cs="Times New Roman"/>
-          <w:sz w:val="24"/>
-          <w:szCs w:val="24"/>
-        </w:rPr>
-        <w:t>1.3 Project Aims, Objectives, and Scope</w:t>
-      </w:r>
-    </w:p>
-    <w:p>
-      <w:pPr>
-        <w:spacing w:before="100" w:beforeAutospacing="1" w:after="100" w:afterAutospacing="1" w:line="240" w:lineRule="auto"/>
-        <w:ind w:left="1080"/>
-        <w:rPr>
-          <w:rFonts w:ascii="Times New Roman" w:eastAsia="Times New Roman" w:hAnsi="Times New Roman" w:cs="Times New Roman"/>
-          <w:sz w:val="24"/>
-          <w:szCs w:val="24"/>
-        </w:rPr>
-      </w:pPr>
-      <w:r>
-        <w:rPr>
-          <w:rFonts w:ascii="Times New Roman" w:eastAsia="Times New Roman" w:hAnsi="Times New Roman" w:cs="Times New Roman"/>
-          <w:sz w:val="24"/>
-          <w:szCs w:val="24"/>
-        </w:rPr>
-        <w:t>1.4 Research Hypotheses</w:t>
-      </w:r>
-    </w:p>
-    <w:p>
-      <w:pPr>
-        <w:spacing w:before="100" w:beforeAutospacing="1" w:after="100" w:afterAutospacing="1" w:line="240" w:lineRule="auto"/>
-        <w:ind w:left="360"/>
-        <w:rPr>
-          <w:rFonts w:ascii="Times New Roman" w:eastAsia="Times New Roman" w:hAnsi="Times New Roman" w:cs="Times New Roman"/>
-          <w:sz w:val="24"/>
-          <w:szCs w:val="24"/>
-        </w:rPr>
-      </w:pPr>
-      <w:r>
-        <w:rPr>
-          <w:rFonts w:ascii="Times New Roman" w:eastAsia="Times New Roman" w:hAnsi="Times New Roman" w:cs="Times New Roman"/>
-          <w:b/>
-          <w:bCs/>
-          <w:sz w:val="24"/>
-          <w:szCs w:val="24"/>
-        </w:rPr>
-        <w:t>Chap</w:t>
-      </w:r>
-      <w:r>
-        <w:rPr>
-          <w:rFonts w:ascii="Times New Roman" w:eastAsia="Times New Roman" w:hAnsi="Times New Roman" w:cs="Times New Roman"/>
-          <w:b/>
-          <w:bCs/>
-          <w:sz w:val="24"/>
-          <w:szCs w:val="24"/>
-        </w:rPr>
-        <w:t>ter 2: Theoretical Foundations and</w:t>
-      </w:r>
-      <w:r>
-        <w:rPr>
-          <w:rFonts w:ascii="Times New Roman" w:eastAsia="Times New Roman" w:hAnsi="Times New Roman" w:cs="Times New Roman"/>
-          <w:b/>
-          <w:bCs/>
-          <w:sz w:val="24"/>
-          <w:szCs w:val="24"/>
-        </w:rPr>
-        <w:t xml:space="preserve"> Background</w:t>
-      </w:r>
-    </w:p>
-    <w:p>
-      <w:pPr>
-        <w:spacing w:before="100" w:beforeAutospacing="1" w:after="100" w:afterAutospacing="1" w:line="240" w:lineRule="auto"/>
-        <w:ind w:left="1080"/>
-        <w:rPr>
-          <w:rFonts w:ascii="Times New Roman" w:eastAsia="Times New Roman" w:hAnsi="Times New Roman" w:cs="Times New Roman"/>
-          <w:sz w:val="24"/>
-          <w:szCs w:val="24"/>
-        </w:rPr>
-      </w:pPr>
-      <w:r>
-        <w:rPr>
-          <w:rFonts w:ascii="Times New Roman" w:eastAsia="Times New Roman" w:hAnsi="Times New Roman" w:cs="Times New Roman"/>
-          <w:sz w:val="24"/>
-          <w:szCs w:val="24"/>
-        </w:rPr>
-        <w:t>2.1 Morphology of University Regulatory Frameworks</w:t>
-      </w:r>
-    </w:p>
-    <w:p>
-      <w:pPr>
-        <w:spacing w:before="100" w:beforeAutospacing="1" w:after="100" w:afterAutospacing="1" w:line="240" w:lineRule="auto"/>
-        <w:ind w:left="1080"/>
-        <w:rPr>
-          <w:rFonts w:ascii="Times New Roman" w:eastAsia="Times New Roman" w:hAnsi="Times New Roman" w:cs="Times New Roman"/>
-          <w:sz w:val="24"/>
-          <w:szCs w:val="24"/>
-        </w:rPr>
-      </w:pPr>
-      <w:r>
-        <w:rPr>
-          <w:rFonts w:ascii="Times New Roman" w:eastAsia="Times New Roman" w:hAnsi="Times New Roman" w:cs="Times New Roman"/>
-          <w:sz w:val="24"/>
-          <w:szCs w:val="24"/>
-        </w:rPr>
-        <w:t>2.2 Natural Language Processing in Regulatory Sourcing</w:t>
-      </w:r>
-    </w:p>
-    <w:p>
-      <w:pPr>
-        <w:spacing w:before="100" w:beforeAutospacing="1" w:after="100" w:afterAutospacing="1" w:line="240" w:lineRule="auto"/>
-        <w:ind w:left="1080"/>
-        <w:rPr>
-          <w:rFonts w:ascii="Times New Roman" w:eastAsia="Times New Roman" w:hAnsi="Times New Roman" w:cs="Times New Roman"/>
-          <w:sz w:val="24"/>
-          <w:szCs w:val="24"/>
-        </w:rPr>
-      </w:pPr>
-      <w:r>
-        <w:rPr>
-          <w:rFonts w:ascii="Times New Roman" w:eastAsia="Times New Roman" w:hAnsi="Times New Roman" w:cs="Times New Roman"/>
-          <w:sz w:val="24"/>
-          <w:szCs w:val="24"/>
-        </w:rPr>
-        <w:t>2.3 The RAG Paradigm: Parametric vs. Non-Parametric Memory</w:t>
-      </w:r>
-    </w:p>
-    <w:p>
-      <w:pPr>
-        <w:spacing w:before="100" w:beforeAutospacing="1" w:after="100" w:afterAutospacing="1" w:line="240" w:lineRule="auto"/>
-        <w:ind w:left="360"/>
-        <w:rPr>
-          <w:rFonts w:ascii="Times New Roman" w:eastAsia="Times New Roman" w:hAnsi="Times New Roman" w:cs="Times New Roman"/>
-          <w:sz w:val="24"/>
-          <w:szCs w:val="24"/>
-        </w:rPr>
-      </w:pPr>
-      <w:r>
-        <w:rPr>
-          <w:rFonts w:ascii="Times New Roman" w:eastAsia="Times New Roman" w:hAnsi="Times New Roman" w:cs="Times New Roman"/>
-          <w:b/>
-          <w:bCs/>
-          <w:sz w:val="24"/>
-          <w:szCs w:val="24"/>
-        </w:rPr>
-        <w:t>Chapter 3: Literature Review and</w:t>
-      </w:r>
-      <w:r>
-        <w:rPr>
-          <w:rFonts w:ascii="Times New Roman" w:eastAsia="Times New Roman" w:hAnsi="Times New Roman" w:cs="Times New Roman"/>
-          <w:b/>
-          <w:bCs/>
-          <w:sz w:val="24"/>
-          <w:szCs w:val="24"/>
-        </w:rPr>
-        <w:t xml:space="preserve"> Academic Foundations</w:t>
-      </w:r>
-    </w:p>
-    <w:p>
-      <w:pPr>
-        <w:spacing w:before="100" w:beforeAutospacing="1" w:after="100" w:afterAutospacing="1" w:line="240" w:lineRule="auto"/>
-        <w:ind w:left="1080"/>
-        <w:rPr>
-          <w:rFonts w:ascii="Times New Roman" w:eastAsia="Times New Roman" w:hAnsi="Times New Roman" w:cs="Times New Roman"/>
-          <w:sz w:val="24"/>
-          <w:szCs w:val="24"/>
-        </w:rPr>
-      </w:pPr>
-      <w:r>
-        <w:rPr>
-          <w:rFonts w:ascii="Times New Roman" w:eastAsia="Times New Roman" w:hAnsi="Times New Roman" w:cs="Times New Roman"/>
-          <w:sz w:val="24"/>
-          <w:szCs w:val="24"/>
-        </w:rPr>
-        <w:t>3.1 Foundational Retrieval-Augmented Generation</w:t>
-      </w:r>
-    </w:p>
-    <w:p>
-      <w:pPr>
-        <w:spacing w:before="100" w:beforeAutospacing="1" w:after="100" w:afterAutospacing="1" w:line="240" w:lineRule="auto"/>
-        <w:ind w:left="1080"/>
-        <w:rPr>
-          <w:rFonts w:ascii="Times New Roman" w:eastAsia="Times New Roman" w:hAnsi="Times New Roman" w:cs="Times New Roman"/>
-          <w:sz w:val="24"/>
-          <w:szCs w:val="24"/>
-        </w:rPr>
-      </w:pPr>
-      <w:r>
-        <w:rPr>
-          <w:rFonts w:ascii="Times New Roman" w:eastAsia="Times New Roman" w:hAnsi="Times New Roman" w:cs="Times New Roman"/>
-          <w:sz w:val="24"/>
-          <w:szCs w:val="24"/>
-        </w:rPr>
-        <w:t>3.2 Dense vs. Sparse Lexical Search Mechanics</w:t>
-      </w:r>
-    </w:p>
-    <w:p>
-      <w:pPr>
-        <w:spacing w:before="100" w:beforeAutospacing="1" w:after="100" w:afterAutospacing="1" w:line="240" w:lineRule="auto"/>
-        <w:ind w:left="1080"/>
-        <w:rPr>
-          <w:rFonts w:ascii="Times New Roman" w:eastAsia="Times New Roman" w:hAnsi="Times New Roman" w:cs="Times New Roman"/>
-          <w:sz w:val="24"/>
-          <w:szCs w:val="24"/>
-        </w:rPr>
-      </w:pPr>
-      <w:r>
-        <w:rPr>
-          <w:rFonts w:ascii="Times New Roman" w:eastAsia="Times New Roman" w:hAnsi="Times New Roman" w:cs="Times New Roman"/>
-          <w:sz w:val="24"/>
-          <w:szCs w:val="24"/>
-        </w:rPr>
-        <w:t>3.3 Rank Aggregation and Reciprocal Rank Fusion</w:t>
-      </w:r>
-    </w:p>
-    <w:p>
-      <w:pPr>
-        <w:spacing w:before="100" w:beforeAutospacing="1" w:after="100" w:afterAutospacing="1" w:line="240" w:lineRule="auto"/>
-        <w:ind w:left="1080"/>
-        <w:rPr>
-          <w:rFonts w:ascii="Times New Roman" w:eastAsia="Times New Roman" w:hAnsi="Times New Roman" w:cs="Times New Roman"/>
-          <w:sz w:val="24"/>
-          <w:szCs w:val="24"/>
-        </w:rPr>
-      </w:pPr>
-      <w:r>
-        <w:rPr>
-          <w:rFonts w:ascii="Times New Roman" w:eastAsia="Times New Roman" w:hAnsi="Times New Roman" w:cs="Times New Roman"/>
-          <w:sz w:val="24"/>
-          <w:szCs w:val="24"/>
-        </w:rPr>
-        <w:t>3.4 Conversational Memory and</w:t>
-      </w:r>
-      <w:r>
-        <w:rPr>
-          <w:rFonts w:ascii="Times New Roman" w:eastAsia="Times New Roman" w:hAnsi="Times New Roman" w:cs="Times New Roman"/>
-          <w:sz w:val="24"/>
-          <w:szCs w:val="24"/>
-        </w:rPr>
-        <w:t xml:space="preserve"> Pre-Retrieval Condensation</w:t>
-      </w:r>
-    </w:p>
-    <w:p>
-      <w:pPr>
-        <w:spacing w:before="100" w:beforeAutospacing="1" w:after="100" w:afterAutospacing="1" w:line="240" w:lineRule="auto"/>
-        <w:ind w:left="360"/>
-        <w:rPr>
-          <w:rFonts w:ascii="Times New Roman" w:eastAsia="Times New Roman" w:hAnsi="Times New Roman" w:cs="Times New Roman"/>
-          <w:sz w:val="24"/>
-          <w:szCs w:val="24"/>
-        </w:rPr>
-      </w:pPr>
+          <w:bCs/>
+          <w:sz w:val="24"/>
+          <w:szCs w:val="24"/>
+        </w:rPr>
+      </w:pPr>
+      <w:r>
+        <w:rPr>
+          <w:rFonts w:ascii="Times New Roman" w:eastAsia="Times New Roman" w:hAnsi="Times New Roman" w:cs="Times New Roman"/>
+          <w:bCs/>
+          <w:sz w:val="24"/>
+          <w:szCs w:val="24"/>
+        </w:rPr>
+        <w:t>Initial draft for Repor</w:t>
+      </w:r>
       <w:bookmarkStart w:id="0" w:name="_GoBack"/>
       <w:bookmarkEnd w:id="0"/>
       <w:r>
         <w:rPr>
           <w:rFonts w:ascii="Times New Roman" w:eastAsia="Times New Roman" w:hAnsi="Times New Roman" w:cs="Times New Roman"/>
+          <w:bCs/>
+          <w:sz w:val="24"/>
+          <w:szCs w:val="24"/>
+        </w:rPr>
+        <w:t>t</w:t>
+      </w:r>
+    </w:p>
+    <w:p>
+      <w:pPr>
+        <w:spacing w:before="100" w:beforeAutospacing="1" w:after="100" w:afterAutospacing="1" w:line="240" w:lineRule="auto"/>
+        <w:ind w:left="360"/>
+        <w:rPr>
+          <w:rFonts w:ascii="Times New Roman" w:eastAsia="Times New Roman" w:hAnsi="Times New Roman" w:cs="Times New Roman"/>
+          <w:sz w:val="24"/>
+          <w:szCs w:val="24"/>
+        </w:rPr>
+      </w:pPr>
+      <w:r>
+        <w:rPr>
+          <w:rFonts w:ascii="Times New Roman" w:eastAsia="Times New Roman" w:hAnsi="Times New Roman" w:cs="Times New Roman"/>
+          <w:b/>
+          <w:bCs/>
+          <w:sz w:val="24"/>
+          <w:szCs w:val="24"/>
+        </w:rPr>
+        <w:t>Chapter 1: Introduction</w:t>
+      </w:r>
+    </w:p>
+    <w:p>
+      <w:pPr>
+        <w:spacing w:before="100" w:beforeAutospacing="1" w:after="100" w:afterAutospacing="1" w:line="240" w:lineRule="auto"/>
+        <w:ind w:left="1080"/>
+        <w:rPr>
+          <w:rFonts w:ascii="Times New Roman" w:eastAsia="Times New Roman" w:hAnsi="Times New Roman" w:cs="Times New Roman"/>
+          <w:sz w:val="24"/>
+          <w:szCs w:val="24"/>
+        </w:rPr>
+      </w:pPr>
+      <w:r>
+        <w:rPr>
+          <w:rFonts w:ascii="Times New Roman" w:eastAsia="Times New Roman" w:hAnsi="Times New Roman" w:cs="Times New Roman"/>
+          <w:sz w:val="24"/>
+          <w:szCs w:val="24"/>
+        </w:rPr>
+        <w:t>1</w:t>
+      </w:r>
+      <w:r>
+        <w:rPr>
+          <w:rFonts w:ascii="Times New Roman" w:eastAsia="Times New Roman" w:hAnsi="Times New Roman" w:cs="Times New Roman"/>
+          <w:sz w:val="24"/>
+          <w:szCs w:val="24"/>
+        </w:rPr>
+        <w:t xml:space="preserve">.1 Background and </w:t>
+      </w:r>
+      <w:r>
+        <w:rPr>
+          <w:rFonts w:ascii="Times New Roman" w:eastAsia="Times New Roman" w:hAnsi="Times New Roman" w:cs="Times New Roman"/>
+          <w:sz w:val="24"/>
+          <w:szCs w:val="24"/>
+        </w:rPr>
+        <w:t>Motivation</w:t>
+      </w:r>
+    </w:p>
+    <w:p>
+      <w:pPr>
+        <w:spacing w:before="100" w:beforeAutospacing="1" w:after="100" w:afterAutospacing="1" w:line="240" w:lineRule="auto"/>
+        <w:ind w:left="1080"/>
+        <w:rPr>
+          <w:rFonts w:ascii="Times New Roman" w:eastAsia="Times New Roman" w:hAnsi="Times New Roman" w:cs="Times New Roman"/>
+          <w:sz w:val="24"/>
+          <w:szCs w:val="24"/>
+        </w:rPr>
+      </w:pPr>
+      <w:r>
+        <w:rPr>
+          <w:rFonts w:ascii="Times New Roman" w:eastAsia="Times New Roman" w:hAnsi="Times New Roman" w:cs="Times New Roman"/>
+          <w:sz w:val="24"/>
+          <w:szCs w:val="24"/>
+        </w:rPr>
+        <w:t>1.2 Research Problem Statement</w:t>
+      </w:r>
+    </w:p>
+    <w:p>
+      <w:pPr>
+        <w:spacing w:before="100" w:beforeAutospacing="1" w:after="100" w:afterAutospacing="1" w:line="240" w:lineRule="auto"/>
+        <w:ind w:left="1080"/>
+        <w:rPr>
+          <w:rFonts w:ascii="Times New Roman" w:eastAsia="Times New Roman" w:hAnsi="Times New Roman" w:cs="Times New Roman"/>
+          <w:sz w:val="24"/>
+          <w:szCs w:val="24"/>
+        </w:rPr>
+      </w:pPr>
+      <w:r>
+        <w:rPr>
+          <w:rFonts w:ascii="Times New Roman" w:eastAsia="Times New Roman" w:hAnsi="Times New Roman" w:cs="Times New Roman"/>
+          <w:sz w:val="24"/>
+          <w:szCs w:val="24"/>
+        </w:rPr>
+        <w:t>1.3 Project Aims, Objectives, and Scope</w:t>
+      </w:r>
+    </w:p>
+    <w:p>
+      <w:pPr>
+        <w:spacing w:before="100" w:beforeAutospacing="1" w:after="100" w:afterAutospacing="1" w:line="240" w:lineRule="auto"/>
+        <w:ind w:left="1080"/>
+        <w:rPr>
+          <w:rFonts w:ascii="Times New Roman" w:eastAsia="Times New Roman" w:hAnsi="Times New Roman" w:cs="Times New Roman"/>
+          <w:sz w:val="24"/>
+          <w:szCs w:val="24"/>
+        </w:rPr>
+      </w:pPr>
+      <w:r>
+        <w:rPr>
+          <w:rFonts w:ascii="Times New Roman" w:eastAsia="Times New Roman" w:hAnsi="Times New Roman" w:cs="Times New Roman"/>
+          <w:sz w:val="24"/>
+          <w:szCs w:val="24"/>
+        </w:rPr>
+        <w:t>1.4 Research Hypotheses</w:t>
+      </w:r>
+    </w:p>
+    <w:p>
+      <w:pPr>
+        <w:spacing w:before="100" w:beforeAutospacing="1" w:after="100" w:afterAutospacing="1" w:line="240" w:lineRule="auto"/>
+        <w:ind w:left="360"/>
+        <w:rPr>
+          <w:rFonts w:ascii="Times New Roman" w:eastAsia="Times New Roman" w:hAnsi="Times New Roman" w:cs="Times New Roman"/>
+          <w:sz w:val="24"/>
+          <w:szCs w:val="24"/>
+        </w:rPr>
+      </w:pPr>
+      <w:r>
+        <w:rPr>
+          <w:rFonts w:ascii="Times New Roman" w:eastAsia="Times New Roman" w:hAnsi="Times New Roman" w:cs="Times New Roman"/>
+          <w:b/>
+          <w:bCs/>
+          <w:sz w:val="24"/>
+          <w:szCs w:val="24"/>
+        </w:rPr>
+        <w:t>Chap</w:t>
+      </w:r>
+      <w:r>
+        <w:rPr>
+          <w:rFonts w:ascii="Times New Roman" w:eastAsia="Times New Roman" w:hAnsi="Times New Roman" w:cs="Times New Roman"/>
+          <w:b/>
+          <w:bCs/>
+          <w:sz w:val="24"/>
+          <w:szCs w:val="24"/>
+        </w:rPr>
+        <w:t>ter 2: Theoretical Foundations and</w:t>
+      </w:r>
+      <w:r>
+        <w:rPr>
+          <w:rFonts w:ascii="Times New Roman" w:eastAsia="Times New Roman" w:hAnsi="Times New Roman" w:cs="Times New Roman"/>
+          <w:b/>
+          <w:bCs/>
+          <w:sz w:val="24"/>
+          <w:szCs w:val="24"/>
+        </w:rPr>
+        <w:t xml:space="preserve"> Background</w:t>
+      </w:r>
+    </w:p>
+    <w:p>
+      <w:pPr>
+        <w:spacing w:before="100" w:beforeAutospacing="1" w:after="100" w:afterAutospacing="1" w:line="240" w:lineRule="auto"/>
+        <w:ind w:left="1080"/>
+        <w:rPr>
+          <w:rFonts w:ascii="Times New Roman" w:eastAsia="Times New Roman" w:hAnsi="Times New Roman" w:cs="Times New Roman"/>
+          <w:sz w:val="24"/>
+          <w:szCs w:val="24"/>
+        </w:rPr>
+      </w:pPr>
+      <w:r>
+        <w:rPr>
+          <w:rFonts w:ascii="Times New Roman" w:eastAsia="Times New Roman" w:hAnsi="Times New Roman" w:cs="Times New Roman"/>
+          <w:sz w:val="24"/>
+          <w:szCs w:val="24"/>
+        </w:rPr>
+        <w:t>2.1 Morphology of University Regulatory Frameworks</w:t>
+      </w:r>
+    </w:p>
+    <w:p>
+      <w:pPr>
+        <w:spacing w:before="100" w:beforeAutospacing="1" w:after="100" w:afterAutospacing="1" w:line="240" w:lineRule="auto"/>
+        <w:ind w:left="1080"/>
+        <w:rPr>
+          <w:rFonts w:ascii="Times New Roman" w:eastAsia="Times New Roman" w:hAnsi="Times New Roman" w:cs="Times New Roman"/>
+          <w:sz w:val="24"/>
+          <w:szCs w:val="24"/>
+        </w:rPr>
+      </w:pPr>
+      <w:r>
+        <w:rPr>
+          <w:rFonts w:ascii="Times New Roman" w:eastAsia="Times New Roman" w:hAnsi="Times New Roman" w:cs="Times New Roman"/>
+          <w:sz w:val="24"/>
+          <w:szCs w:val="24"/>
+        </w:rPr>
+        <w:t>2.2 Natural Language Processing in Regulatory Sourcing</w:t>
+      </w:r>
+    </w:p>
+    <w:p>
+      <w:pPr>
+        <w:spacing w:before="100" w:beforeAutospacing="1" w:after="100" w:afterAutospacing="1" w:line="240" w:lineRule="auto"/>
+        <w:ind w:left="1080"/>
+        <w:rPr>
+          <w:rFonts w:ascii="Times New Roman" w:eastAsia="Times New Roman" w:hAnsi="Times New Roman" w:cs="Times New Roman"/>
+          <w:sz w:val="24"/>
+          <w:szCs w:val="24"/>
+        </w:rPr>
+      </w:pPr>
+      <w:r>
+        <w:rPr>
+          <w:rFonts w:ascii="Times New Roman" w:eastAsia="Times New Roman" w:hAnsi="Times New Roman" w:cs="Times New Roman"/>
+          <w:sz w:val="24"/>
+          <w:szCs w:val="24"/>
+        </w:rPr>
+        <w:t>2.3 The RAG Paradigm: Parametric vs. Non-Parametric Memory</w:t>
+      </w:r>
+    </w:p>
+    <w:p>
+      <w:pPr>
+        <w:spacing w:before="100" w:beforeAutospacing="1" w:after="100" w:afterAutospacing="1" w:line="240" w:lineRule="auto"/>
+        <w:ind w:left="360"/>
+        <w:rPr>
+          <w:rFonts w:ascii="Times New Roman" w:eastAsia="Times New Roman" w:hAnsi="Times New Roman" w:cs="Times New Roman"/>
+          <w:sz w:val="24"/>
+          <w:szCs w:val="24"/>
+        </w:rPr>
+      </w:pPr>
+      <w:r>
+        <w:rPr>
+          <w:rFonts w:ascii="Times New Roman" w:eastAsia="Times New Roman" w:hAnsi="Times New Roman" w:cs="Times New Roman"/>
+          <w:b/>
+          <w:bCs/>
+          <w:sz w:val="24"/>
+          <w:szCs w:val="24"/>
+        </w:rPr>
+        <w:t>Chapter 3: Literature Review and</w:t>
+      </w:r>
+      <w:r>
+        <w:rPr>
+          <w:rFonts w:ascii="Times New Roman" w:eastAsia="Times New Roman" w:hAnsi="Times New Roman" w:cs="Times New Roman"/>
+          <w:b/>
+          <w:bCs/>
+          <w:sz w:val="24"/>
+          <w:szCs w:val="24"/>
+        </w:rPr>
+        <w:t xml:space="preserve"> Academic Foundations</w:t>
+      </w:r>
+    </w:p>
+    <w:p>
+      <w:pPr>
+        <w:spacing w:before="100" w:beforeAutospacing="1" w:after="100" w:afterAutospacing="1" w:line="240" w:lineRule="auto"/>
+        <w:ind w:left="1080"/>
+        <w:rPr>
+          <w:rFonts w:ascii="Times New Roman" w:eastAsia="Times New Roman" w:hAnsi="Times New Roman" w:cs="Times New Roman"/>
+          <w:sz w:val="24"/>
+          <w:szCs w:val="24"/>
+        </w:rPr>
+      </w:pPr>
+      <w:r>
+        <w:rPr>
+          <w:rFonts w:ascii="Times New Roman" w:eastAsia="Times New Roman" w:hAnsi="Times New Roman" w:cs="Times New Roman"/>
+          <w:sz w:val="24"/>
+          <w:szCs w:val="24"/>
+        </w:rPr>
+        <w:t>3.1 Foundational Retrieval-Augmented Generation</w:t>
+      </w:r>
+    </w:p>
+    <w:p>
+      <w:pPr>
+        <w:spacing w:before="100" w:beforeAutospacing="1" w:after="100" w:afterAutospacing="1" w:line="240" w:lineRule="auto"/>
+        <w:ind w:left="1080"/>
+        <w:rPr>
+          <w:rFonts w:ascii="Times New Roman" w:eastAsia="Times New Roman" w:hAnsi="Times New Roman" w:cs="Times New Roman"/>
+          <w:sz w:val="24"/>
+          <w:szCs w:val="24"/>
+        </w:rPr>
+      </w:pPr>
+      <w:r>
+        <w:rPr>
+          <w:rFonts w:ascii="Times New Roman" w:eastAsia="Times New Roman" w:hAnsi="Times New Roman" w:cs="Times New Roman"/>
+          <w:sz w:val="24"/>
+          <w:szCs w:val="24"/>
+        </w:rPr>
+        <w:t>3.2 Dense vs. Sparse Lexical Search Mechanics</w:t>
+      </w:r>
+    </w:p>
+    <w:p>
+      <w:pPr>
+        <w:spacing w:before="100" w:beforeAutospacing="1" w:after="100" w:afterAutospacing="1" w:line="240" w:lineRule="auto"/>
+        <w:ind w:left="1080"/>
+        <w:rPr>
+          <w:rFonts w:ascii="Times New Roman" w:eastAsia="Times New Roman" w:hAnsi="Times New Roman" w:cs="Times New Roman"/>
+          <w:sz w:val="24"/>
+          <w:szCs w:val="24"/>
+        </w:rPr>
+      </w:pPr>
+      <w:r>
+        <w:rPr>
+          <w:rFonts w:ascii="Times New Roman" w:eastAsia="Times New Roman" w:hAnsi="Times New Roman" w:cs="Times New Roman"/>
+          <w:sz w:val="24"/>
+          <w:szCs w:val="24"/>
+        </w:rPr>
+        <w:t>3.3 Rank Aggregation and Reciprocal Rank Fusion</w:t>
+      </w:r>
+    </w:p>
+    <w:p>
+      <w:pPr>
+        <w:spacing w:before="100" w:beforeAutospacing="1" w:after="100" w:afterAutospacing="1" w:line="240" w:lineRule="auto"/>
+        <w:ind w:left="1080"/>
+        <w:rPr>
+          <w:rFonts w:ascii="Times New Roman" w:eastAsia="Times New Roman" w:hAnsi="Times New Roman" w:cs="Times New Roman"/>
+          <w:sz w:val="24"/>
+          <w:szCs w:val="24"/>
+        </w:rPr>
+      </w:pPr>
+      <w:r>
+        <w:rPr>
+          <w:rFonts w:ascii="Times New Roman" w:eastAsia="Times New Roman" w:hAnsi="Times New Roman" w:cs="Times New Roman"/>
+          <w:sz w:val="24"/>
+          <w:szCs w:val="24"/>
+        </w:rPr>
+        <w:t>3.4 Conversational Memory and</w:t>
+      </w:r>
+      <w:r>
+        <w:rPr>
+          <w:rFonts w:ascii="Times New Roman" w:eastAsia="Times New Roman" w:hAnsi="Times New Roman" w:cs="Times New Roman"/>
+          <w:sz w:val="24"/>
+          <w:szCs w:val="24"/>
+        </w:rPr>
+        <w:t xml:space="preserve"> Pre-Retrieval Condensation</w:t>
+      </w:r>
+    </w:p>
+    <w:p>
+      <w:pPr>
+        <w:spacing w:before="100" w:beforeAutospacing="1" w:after="100" w:afterAutospacing="1" w:line="240" w:lineRule="auto"/>
+        <w:ind w:left="360"/>
+        <w:rPr>
+          <w:rFonts w:ascii="Times New Roman" w:eastAsia="Times New Roman" w:hAnsi="Times New Roman" w:cs="Times New Roman"/>
+          <w:sz w:val="24"/>
+          <w:szCs w:val="24"/>
+        </w:rPr>
+      </w:pPr>
+      <w:r>
+        <w:rPr>
+          <w:rFonts w:ascii="Times New Roman" w:eastAsia="Times New Roman" w:hAnsi="Times New Roman" w:cs="Times New Roman"/>
           <w:b/>
           <w:bCs/>
           <w:sz w:val="24"/>
@@ -588,6 +618,7 @@
           <w:sz w:val="24"/>
           <w:szCs w:val="24"/>
         </w:rPr>
+        <w:lastRenderedPageBreak/>
         <w:t>5.3 C</w:t>
       </w:r>
       <w:r>
@@ -623,7 +654,6 @@
           <w:sz w:val="24"/>
           <w:szCs w:val="24"/>
         </w:rPr>
-        <w:lastRenderedPageBreak/>
         <w:t>5.4 Challenge 3: RRF Poin</w:t>
       </w:r>
       <w:r>

</xml_diff>